<commit_message>
Add Dan's Technical Infrastructure Affidavit reference to Section 3
Co-authored-by: drzo <15202748+drzo@users.noreply.github.com>
</commit_message>
<xml_diff>
--- a/jax-dan-response/source-documents/DRAFTOFMAINPOINTS-RESPONSE.docx
+++ b/jax-dan-response/source-documents/DRAFTOFMAINPOINTS-RESPONSE.docx
@@ -1286,6 +1286,167 @@
       </w:r>
     </w:p>
     <w:p>
+      <w:r/>
+    </w:p>
+    <w:p>
+      <w:r>
+        <w:t>3.4.4</w:t>
+        <w:t xml:space="preserve"> </w:t>
+        <w:t>Expert Technical Opinion</w:t>
+      </w:r>
+    </w:p>
+    <w:p>
+      <w:r>
+        <w:t xml:space="preserve">As a qualified CIO with over 20 years of experience in information technology and international business operations, the Second Respondent's Technical Infrastructure Affidavit provides expert technical opinion on:</w:t>
+      </w:r>
+    </w:p>
+    <w:p>
+      <w:r>
+        <w:t xml:space="preserve">(a) The necessity and appropriateness of each category of IT expense;</w:t>
+      </w:r>
+    </w:p>
+    <w:p>
+      <w:r>
+        <w:t xml:space="preserve">(b) Industry benchmarks for comparable international e-commerce businesses;</w:t>
+      </w:r>
+    </w:p>
+    <w:p>
+      <w:r>
+        <w:t xml:space="preserve">(c) The technical impossibility of operating the business without the infrastructure complained of;</w:t>
+      </w:r>
+    </w:p>
+    <w:p>
+      <w:r>
+        <w:t xml:space="preserve">(d) The devastating operational and compliance impact of the interdict on IT infrastructure.</w:t>
+      </w:r>
+    </w:p>
+    <w:p>
+      <w:r/>
+    </w:p>
+    <w:p>
+      <w:r>
+        <w:t>3.4.3</w:t>
+        <w:t xml:space="preserve"> </w:t>
+        <w:t>Peter's Creation of Documentation Gap</w:t>
+      </w:r>
+    </w:p>
+    <w:p>
+      <w:r>
+        <w:t xml:space="preserve">The Technical Infrastructure Affidavit further demonstrates how the Applicant's own actions in June 2025 (cancelling access cards and restricting system access) created the very documentation gaps he now complains about, including:</w:t>
+      </w:r>
+    </w:p>
+    <w:p>
+      <w:r>
+        <w:t xml:space="preserve">(a) Disruption of cloud storage and backup systems;</w:t>
+      </w:r>
+    </w:p>
+    <w:p>
+      <w:r>
+        <w:t xml:space="preserve">(b) Suspension of accounting software access;</w:t>
+      </w:r>
+    </w:p>
+    <w:p>
+      <w:r>
+        <w:t xml:space="preserve">(c) Termination of email services and domain registrations;</w:t>
+      </w:r>
+    </w:p>
+    <w:p>
+      <w:r>
+        <w:t xml:space="preserve">(d) Forced emergency restoration using personal funds (R50,000-R75,000) to prevent business collapse.</w:t>
+      </w:r>
+    </w:p>
+    <w:p>
+      <w:r/>
+    </w:p>
+    <w:p>
+      <w:r>
+        <w:t>3.4.2</w:t>
+        <w:t xml:space="preserve"> </w:t>
+        <w:t>Industry Benchmark Validation</w:t>
+      </w:r>
+    </w:p>
+    <w:p>
+      <w:r>
+        <w:t xml:space="preserve">The Technical Infrastructure Affidavit demonstrates that the IT expenses complained of by the Applicant:</w:t>
+      </w:r>
+    </w:p>
+    <w:p>
+      <w:r>
+        <w:t xml:space="preserve">(a) Fall within industry-standard ranges for international e-commerce businesses (typically 5-10% of revenue, up to 12% for multi-jurisdiction operations);</w:t>
+      </w:r>
+    </w:p>
+    <w:p>
+      <w:r>
+        <w:t xml:space="preserve">(b) Are essential for regulatory compliance across 37 jurisdictions;</w:t>
+      </w:r>
+    </w:p>
+    <w:p>
+      <w:r>
+        <w:t xml:space="preserve">(c) Are necessary for business continuity and customer data protection;</w:t>
+      </w:r>
+    </w:p>
+    <w:p>
+      <w:r>
+        <w:t xml:space="preserve">(d) Are fully justified by the technical requirements of operating an international distribution business.</w:t>
+      </w:r>
+    </w:p>
+    <w:p>
+      <w:r/>
+    </w:p>
+    <w:p>
+      <w:r>
+        <w:t>3.4.1</w:t>
+        <w:t xml:space="preserve"> </w:t>
+        <w:t>Detailed Technical Architecture</w:t>
+      </w:r>
+    </w:p>
+    <w:p>
+      <w:r>
+        <w:t xml:space="preserve">The Technical Infrastructure Affidavit provides comprehensive documentation of:</w:t>
+      </w:r>
+    </w:p>
+    <w:p>
+      <w:r>
+        <w:t xml:space="preserve">(a) E-commerce platform architecture (Shopify Plus multi-store configuration, payment gateways, CDN infrastructure);</w:t>
+      </w:r>
+    </w:p>
+    <w:p>
+      <w:r>
+        <w:t xml:space="preserve">(b) International compliance systems (GDPR, PCI-DSS Level 1, product safety databases across 37 jurisdictions);</w:t>
+      </w:r>
+    </w:p>
+    <w:p>
+      <w:r>
+        <w:t xml:space="preserve">(c) Business automation platform (order management, inventory synchronization, CRM, financial reporting);</w:t>
+      </w:r>
+    </w:p>
+    <w:p>
+      <w:r>
+        <w:t xml:space="preserve">(d) Security and risk management infrastructure (cybersecurity, encryption, backup systems, disaster recovery);</w:t>
+      </w:r>
+    </w:p>
+    <w:p>
+      <w:r>
+        <w:t xml:space="preserve">(e) Cost justification with industry benchmarks demonstrating IT spend of 6-10% of revenue is standard for international e-commerce operations.</w:t>
+      </w:r>
+    </w:p>
+    <w:p>
+      <w:r/>
+    </w:p>
+    <w:p>
+      <w:r>
+        <w:t>3.4</w:t>
+      </w:r>
+    </w:p>
+    <w:p>
+      <w:r>
+        <w:t xml:space="preserve">The Second Respondent, Daniel Faucitt, in his capacity as Chief Information Officer (CIO) of RegimA Worldwide Distribution, has provided a comprehensive Technical Infrastructure Affidavit (Annexure DF1) which provides detailed technical justification for all IT expenses alleged by the Applicant to be "unexplained".</w:t>
+      </w:r>
+    </w:p>
+    <w:p>
+      <w:r/>
+    </w:p>
+    <w:p>
       <w:pPr>
         <w:rPr>
           <w:b/>
@@ -3589,6 +3750,12 @@
         <w:t>Annexure JF5: Schedule of IT Expenses with Invoices</w:t>
       </w:r>
     </w:p>
+    <w:p>
+      <w:r>
+        <w:t>Annexure DF1: Daniel Faucitt Technical Infrastructure Affidavit</w:t>
+      </w:r>
+    </w:p>
+    <w:p/>
     <w:p>
       <w:r>
         <w:rPr>

</xml_diff>